<commit_message>
docs: bitácora v38.0 — agregar sección 10 animaciones/transiciones index.html
Agrega sección 10 con detalle de: transiciones CSS dark↔light, animación
de logo hdr-brand al cargar menú, splash adaptado al tema oscuro guardado.
Actualiza commits (8 total), parámetros (index.html en archivos modificados)
y renumera secciones 11-13.

Co-Authored-By: Claude Sonnet 4.6 <noreply@anthropic.com>
</commit_message>
<xml_diff>
--- a/Bitacoras/GestorUrbano_Bitacora_v38_0.docx
+++ b/Bitacoras/GestorUrbano_Bitacora_v38_0.docx
@@ -1927,6 +1927,72 @@
           </w:p>
         </w:tc>
       </w:tr>
+      <w:tr>
+        <w:tc>
+          <w:tcPr>
+            <w:tcW w:type="dxa" w:w="4320"/>
+          </w:tcPr>
+          <w:p>
+            <w:r>
+              <w:t>`c6e6f29`</w:t>
+            </w:r>
+          </w:p>
+        </w:tc>
+        <w:tc>
+          <w:tcPr>
+            <w:tcW w:type="dxa" w:w="4320"/>
+          </w:tcPr>
+          <w:p>
+            <w:r>
+              <w:t>docs: bitácora v38.0 (.md + .docx)</w:t>
+            </w:r>
+          </w:p>
+        </w:tc>
+      </w:tr>
+      <w:tr>
+        <w:tc>
+          <w:tcPr>
+            <w:tcW w:type="dxa" w:w="4320"/>
+          </w:tcPr>
+          <w:p>
+            <w:r>
+              <w:t>`ad7427c`</w:t>
+            </w:r>
+          </w:p>
+        </w:tc>
+        <w:tc>
+          <w:tcPr>
+            <w:tcW w:type="dxa" w:w="4320"/>
+          </w:tcPr>
+          <w:p>
+            <w:r>
+              <w:t>feat index: transiciones suaves de tema + animación de logo al cargar menú</w:t>
+            </w:r>
+          </w:p>
+        </w:tc>
+      </w:tr>
+      <w:tr>
+        <w:tc>
+          <w:tcPr>
+            <w:tcW w:type="dxa" w:w="4320"/>
+          </w:tcPr>
+          <w:p>
+            <w:r>
+              <w:t>`efb22b4`</w:t>
+            </w:r>
+          </w:p>
+        </w:tc>
+        <w:tc>
+          <w:tcPr>
+            <w:tcW w:type="dxa" w:w="4320"/>
+          </w:tcPr>
+          <w:p>
+            <w:r>
+              <w:t>fix index: splash adapta colores al tema oscuro guardado en localStorage</w:t>
+            </w:r>
+          </w:p>
+        </w:tc>
+      </w:tr>
     </w:tbl>
     <w:p>
       <w:r/>
@@ -1937,7 +2003,7 @@
         <w:t>Total:</w:t>
       </w:r>
       <w:r>
-        <w:t xml:space="preserve"> 5 commits · sesión 12 ago 2026</w:t>
+        <w:t xml:space="preserve"> 8 commits · sesión 12 ago 2026</w:t>
       </w:r>
     </w:p>
     <w:p>
@@ -1953,7 +2019,225 @@
         <w:rPr>
           <w:color w:val="2E4D6B"/>
         </w:rPr>
-        <w:t>10. Parámetros de la sesión</w:t>
+        <w:t>10. Animaciones y transiciones — index.html (Bloque C)</w:t>
+      </w:r>
+    </w:p>
+    <w:p>
+      <w:pPr>
+        <w:pStyle w:val="Heading3"/>
+      </w:pPr>
+      <w:r>
+        <w:t>10.1 Contexto</w:t>
+      </w:r>
+    </w:p>
+    <w:p>
+      <w:r>
+        <w:t>Al final de la sesión Fernando solicitó tres mejoras visuales al menú principal (`index.html`):</w:t>
+      </w:r>
+    </w:p>
+    <w:p>
+      <w:r>
+        <w:t>1. Transición suave al cambiar entre modo oscuro y modo claro.</w:t>
+      </w:r>
+    </w:p>
+    <w:p>
+      <w:r>
+        <w:t>2. Que el splash (intro) respete el tema guardado (no mostrarse blanco si el usuario tiene modo oscuro).</w:t>
+      </w:r>
+    </w:p>
+    <w:p>
+      <w:r>
+        <w:t>3. Que el logo "TrazaUrbana" en el header aparezca con animación de entrada cada vez que el usuario llega al menú (desde un módulo o carga directa).</w:t>
+      </w:r>
+    </w:p>
+    <w:p>
+      <w:pPr>
+        <w:pStyle w:val="Heading3"/>
+      </w:pPr>
+      <w:r>
+        <w:t>10.2 Transición dark↔light</w:t>
+      </w:r>
+    </w:p>
+    <w:p>
+      <w:r>
+        <w:t>Se agregaron reglas CSS de `transition` a los elementos que cambian al alternar tema:</w:t>
+      </w:r>
+    </w:p>
+    <w:p>
+      <w:pPr>
+        <w:ind w:left="576"/>
+      </w:pPr>
+      <w:r>
+        <w:rPr>
+          <w:rFonts w:ascii="Courier New" w:hAnsi="Courier New"/>
+          <w:sz w:val="18"/>
+        </w:rPr>
+        <w:t>body { transition: background-color .4s ease, color .3s ease }</w:t>
+        <w:br/>
+        <w:t>header { transition: background-color .4s ease, border-color .35s ease }</w:t>
+        <w:br/>
+        <w:t>.mod-card { transition: background-color .4s ease, border-color .25s ease, color .3s ease, transform .15s, box-shadow .2s }</w:t>
+        <w:br/>
+        <w:t>.stat-box { transition: background-color .4s ease, border-color .35s ease }</w:t>
+        <w:br/>
+        <w:t>.hero-eyebrow, .tag, .stack-tag, .hbadge, .mod-card-top, .mod-card-body</w:t>
+        <w:br/>
+        <w:t>footer { transition: background-color .4s ease, border-color .35s ease }</w:t>
+      </w:r>
+    </w:p>
+    <w:p>
+      <w:r>
+        <w:t>El cambio de tema pasa de ser instantáneo a un fade suave de ~0.35–0.4s.</w:t>
+      </w:r>
+    </w:p>
+    <w:p>
+      <w:pPr>
+        <w:pStyle w:val="Heading3"/>
+      </w:pPr>
+      <w:r>
+        <w:t>10.3 Animación del logo en el header</w:t>
+      </w:r>
+    </w:p>
+    <w:p>
+      <w:r>
+        <w:t>El `div` que contiene el isotipo SVG y el wordmark "TrazaUrbana" recibió `id="hdr-brand"` y un CSS de entrada:</w:t>
+      </w:r>
+    </w:p>
+    <w:p>
+      <w:pPr>
+        <w:ind w:left="576"/>
+      </w:pPr>
+      <w:r>
+        <w:rPr>
+          <w:rFonts w:ascii="Courier New" w:hAnsi="Courier New"/>
+          <w:sz w:val="18"/>
+        </w:rPr>
+        <w:t>#hdr-brand { opacity: 0; transform: translateY(-6px) scale(.92);</w:t>
+        <w:br/>
+        <w:t xml:space="preserve">             transition: opacity .5s ease .1s, transform .55s cubic-bezier(.34,1.56,.64,1) .1s }</w:t>
+        <w:br/>
+        <w:t>#hdr-brand.live { opacity: 1; transform: none }</w:t>
+      </w:r>
+    </w:p>
+    <w:p>
+      <w:r>
+        <w:t>El logo empieza invisible. Cuando el splash termina (`dismiss()`), el script activa la clase `.live` con 120ms de delay — el isotipo y wordmark aparecen con un spring suave desde arriba.</w:t>
+      </w:r>
+    </w:p>
+    <w:p>
+      <w:r>
+        <w:t>Adicionalmente, al hacer `dismiss()` el SVG del splash ejecuta una animación de contracción hacia arriba antes del fade-out, dando la ilusión de que el isotipo "vuela" hacia el header:</w:t>
+      </w:r>
+    </w:p>
+    <w:p>
+      <w:pPr>
+        <w:ind w:left="576"/>
+      </w:pPr>
+      <w:r>
+        <w:rPr>
+          <w:rFonts w:ascii="Courier New" w:hAnsi="Courier New"/>
+          <w:sz w:val="18"/>
+        </w:rPr>
+        <w:t>_sv.style.transform = 'translateY(-32px) scale(.28)';</w:t>
+        <w:br/>
+        <w:t>_sv.style.opacity = '.08';</w:t>
+      </w:r>
+    </w:p>
+    <w:p>
+      <w:pPr>
+        <w:pStyle w:val="Heading3"/>
+      </w:pPr>
+      <w:r>
+        <w:t>10.4 Splash adaptado al tema guardado</w:t>
+      </w:r>
+    </w:p>
+    <w:p>
+      <w:r/>
+      <w:r>
+        <w:rPr>
+          <w:b/>
+        </w:rPr>
+        <w:t>Problema:</w:t>
+      </w:r>
+      <w:r>
+        <w:t xml:space="preserve"> `#tu-splash` tenía `background:#F6F3EC` (crema) hardcoded. Al cargar en modo oscuro, el splash aparecía blanco sobre lo que debería ser una interfaz oscura.</w:t>
+      </w:r>
+    </w:p>
+    <w:p>
+      <w:r/>
+      <w:r>
+        <w:rPr>
+          <w:b/>
+        </w:rPr>
+        <w:t>Solución:</w:t>
+      </w:r>
+      <w:r>
+        <w:t xml:space="preserve"> Al inicio del script del splash, se lee `localStorage.getItem('gu_theme')`. Si el valor no es `'light'` (incluye el caso sin valor guardado, ya que el default es oscuro), se aplica:</w:t>
+      </w:r>
+    </w:p>
+    <w:p>
+      <w:pPr>
+        <w:ind w:left="576"/>
+      </w:pPr>
+      <w:r>
+        <w:rPr>
+          <w:rFonts w:ascii="Courier New" w:hAnsi="Courier New"/>
+          <w:sz w:val="18"/>
+        </w:rPr>
+        <w:t>s.classList.add('dk');                                    // background #0B0F1A via CSS</w:t>
+        <w:br/>
+        <w:t>_b1.setAttribute('stroke', '#3D7BFF');                    // SVG caja → azul accent</w:t>
+        <w:br/>
+        <w:t>_l1.setAttribute('stroke', '#3D7BFF');                    // SVG línea diagonal → azul accent</w:t>
+        <w:br/>
+        <w:t>_wt.style.color = '#C4D2E0';                              // "Traza" wordmark → gris claro</w:t>
+        <w:br/>
+        <w:t>_tg.style.color = '#4B5563';                              // tagline → gris tenue</w:t>
+      </w:r>
+    </w:p>
+    <w:p>
+      <w:r>
+        <w:t>El naranja `#D85A30` (cuadro del isotipo, "Urbana", barra de progreso) se mantiene igual en ambos temas.</w:t>
+      </w:r>
+    </w:p>
+    <w:p>
+      <w:r/>
+      <w:r>
+        <w:rPr>
+          <w:b/>
+        </w:rPr>
+        <w:t>Resultado:</w:t>
+      </w:r>
+      <w:r>
+        <w:t xml:space="preserve"> el splash ahora coincide con el tema del usuario desde el primer frame.</w:t>
+      </w:r>
+    </w:p>
+    <w:p>
+      <w:r/>
+      <w:r>
+        <w:rPr>
+          <w:b/>
+        </w:rPr>
+        <w:t>Commits:</w:t>
+      </w:r>
+      <w:r>
+        <w:t xml:space="preserve"> `ad7427c` · `efb22b4`</w:t>
+      </w:r>
+    </w:p>
+    <w:p>
+      <w:r>
+        <w:t>────────────────────────────────────────────────────────────</w:t>
+      </w:r>
+    </w:p>
+    <w:p>
+      <w:pPr>
+        <w:pStyle w:val="Heading2"/>
+      </w:pPr>
+      <w:r>
+        <w:rPr>
+          <w:color w:val="2E4D6B"/>
+        </w:rPr>
+        <w:t>11. Parámetros de la sesión</w:t>
       </w:r>
     </w:p>
     <w:tbl>
@@ -2121,7 +2405,7 @@
           </w:tcPr>
           <w:p>
             <w:r>
-              <w:t>GestorUrbano_M02_4.html · GestorUrbano_M07_1.html</w:t>
+              <w:t>GestorUrbano_M02_4.html · GestorUrbano_M07_1.html · index.html</w:t>
             </w:r>
           </w:p>
         </w:tc>
@@ -2184,7 +2468,7 @@
         <w:rPr>
           <w:color w:val="2E4D6B"/>
         </w:rPr>
-        <w:t>11. Estado de módulos al 12 ago 2026</w:t>
+        <w:t>12. Estado de módulos al 12 ago 2026</w:t>
       </w:r>
     </w:p>
     <w:tbl>
@@ -2573,7 +2857,7 @@
         <w:rPr>
           <w:color w:val="2E4D6B"/>
         </w:rPr>
-        <w:t>12. Pendientes arrastrados</w:t>
+        <w:t>13. Pendientes arrastrados</w:t>
       </w:r>
     </w:p>
     <w:p>

</xml_diff>

<commit_message>
docs: bitácora v38.0 — secciones 13-14 bug patrimonial + auditoría 51 subdistritos GDL
Co-Authored-By: Claude Sonnet 4.6 <noreply@anthropic.com>
</commit_message>
<xml_diff>
--- a/Bitacoras/GestorUrbano_Bitacora_v38_0.docx
+++ b/Bitacoras/GestorUrbano_Bitacora_v38_0.docx
@@ -2862,6 +2862,38 @@
           </w:p>
         </w:tc>
       </w:tr>
+      <w:tr>
+        <w:tc>
+          <w:tcPr>
+            <w:tcW w:type="dxa" w:w="4703"/>
+          </w:tcPr>
+          <w:p>
+            <w:pPr>
+              <w:spacing w:before="20" w:after="20"/>
+            </w:pPr>
+            <w:r>
+              <w:rPr>
+                <w:rFonts w:ascii="Courier New" w:hAnsi="Courier New"/>
+                <w:sz w:val="18"/>
+              </w:rPr>
+              <w:t>c927da6</w:t>
+            </w:r>
+          </w:p>
+        </w:tc>
+        <w:tc>
+          <w:tcPr>
+            <w:tcW w:type="dxa" w:w="4703"/>
+          </w:tcPr>
+          <w:p>
+            <w:pPr>
+              <w:spacing w:before="20" w:after="20"/>
+            </w:pPr>
+            <w:r>
+              <w:t>fix M01/M10: detección patrimonial — eliminar sub1==='05' del esCentroHist (falso positivo en D3/D4/D7-SD05)</w:t>
+            </w:r>
+          </w:p>
+        </w:tc>
+      </w:tr>
     </w:tbl>
     <w:p/>
     <w:p>
@@ -2875,7 +2907,7 @@
         <w:t>Total:</w:t>
       </w:r>
       <w:r>
-        <w:t xml:space="preserve"> 10 commits · sesiones 12–14 ago 2026</w:t>
+        <w:t xml:space="preserve"> 11 commits · sesiones 12–15 ago 2026</w:t>
       </w:r>
     </w:p>
     <w:p>
@@ -4304,7 +4336,1843 @@
         <w:pStyle w:val="Heading2"/>
       </w:pPr>
       <w:r>
-        <w:t>13. Parámetros de la sesión</w:t>
+        <w:t>13. Fix bug detección patrimonial — M01 y M10 (sesión 15 ago 2026)</w:t>
+      </w:r>
+    </w:p>
+    <w:p>
+      <w:pPr>
+        <w:pStyle w:val="Heading3"/>
+      </w:pPr>
+      <w:r>
+        <w:t>13.1 Contexto</w:t>
+      </w:r>
+    </w:p>
+    <w:p>
+      <w:pPr>
+        <w:spacing w:after="100"/>
+      </w:pPr>
+      <w:r>
+        <w:t>Se detectó que el predio Alpes 2937 (Expediente 039/D3/2024/0364) aparecía en M01 y M10 con restricción patrimonial "Monumento Histórico por Determinación de Ley". El DTUD oficial (Dictamen de Trazo, Usos y Destinos Específicos) adjunto declaraba explícitamente:</w:t>
+      </w:r>
+    </w:p>
+    <w:p>
+      <w:pPr>
+        <w:spacing w:after="100"/>
+      </w:pPr>
+      <w:r>
+        <w:t xml:space="preserve">&gt; </w:t>
+      </w:r>
+      <w:r>
+        <w:rPr>
+          <w:b/>
+        </w:rPr>
+        <w:t>"EL PREDIO NO FORMA PARTE DEL PATRIMONIO HISTÓRICO Y/O CULTURAL DEL ESTADO DE JALISCO"</w:t>
+      </w:r>
+    </w:p>
+    <w:p>
+      <w:pPr>
+        <w:spacing w:after="100"/>
+      </w:pPr>
+      <w:r>
+        <w:t>El predio pertenece a D3-SD05 La Federacha — no al D1-SD05 Centro Histórico.</w:t>
+      </w:r>
+    </w:p>
+    <w:p>
+      <w:pPr>
+        <w:pStyle w:val="Heading3"/>
+      </w:pPr>
+      <w:r>
+        <w:t>13.2 Causa raíz</w:t>
+      </w:r>
+    </w:p>
+    <w:p>
+      <w:pPr>
+        <w:spacing w:after="100"/>
+      </w:pPr>
+      <w:r>
+        <w:t>En M01 (línea 4189) y M10 (línea 4325) existía:</w:t>
+      </w:r>
+    </w:p>
+    <w:p>
+      <w:pPr>
+        <w:spacing w:before="60" w:after="120"/>
+        <w:ind w:left="360"/>
+        <w:shd w:val="clear" w:color="auto" w:fill="F4F4F4"/>
+      </w:pPr>
+      <w:r>
+        <w:rPr>
+          <w:rFonts w:ascii="Courier New" w:hAnsi="Courier New"/>
+          <w:sz w:val="16"/>
+        </w:rPr>
+        <w:t>// BUG — activa esCentroHist en CUALQUIER subdistrito con sub1='05'</w:t>
+        <w:br/>
+        <w:t>const esCentroHist = sub === '05' || sub2.includes('centro hist');</w:t>
+      </w:r>
+    </w:p>
+    <w:p>
+      <w:pPr>
+        <w:spacing w:after="100"/>
+      </w:pPr>
+      <w:r>
+        <w:t xml:space="preserve">El campo </w:t>
+      </w:r>
+      <w:r>
+        <w:rPr>
+          <w:rFonts w:ascii="Courier New" w:hAnsi="Courier New"/>
+          <w:sz w:val="18"/>
+        </w:rPr>
+        <w:t>sub1</w:t>
+      </w:r>
+      <w:r>
+        <w:t xml:space="preserve"> es el número de subdistrito dentro del distrito, no único a nivel ciudad. Todos los distritos (D1–D7) tienen un subdistrito </w:t>
+      </w:r>
+      <w:r>
+        <w:rPr>
+          <w:rFonts w:ascii="Courier New" w:hAnsi="Courier New"/>
+          <w:sz w:val="18"/>
+        </w:rPr>
+        <w:t>05</w:t>
+      </w:r>
+      <w:r>
+        <w:t>, y D3-SD05 (La Federacha), D2-SD05 (Colinas de San Javier), D4-SD05 (Oriente) y D7-SD05 (Álamo - La Nogalera) activaban incorrectamente el fallback patrimonial.</w:t>
+      </w:r>
+    </w:p>
+    <w:p>
+      <w:pPr>
+        <w:pStyle w:val="Heading3"/>
+      </w:pPr>
+      <w:r>
+        <w:t>13.3 Fix aplicado</w:t>
+      </w:r>
+    </w:p>
+    <w:p>
+      <w:pPr>
+        <w:spacing w:before="60" w:after="120"/>
+        <w:ind w:left="360"/>
+        <w:shd w:val="clear" w:color="auto" w:fill="F4F4F4"/>
+      </w:pPr>
+      <w:r>
+        <w:rPr>
+          <w:rFonts w:ascii="Courier New" w:hAnsi="Courier New"/>
+          <w:sz w:val="16"/>
+        </w:rPr>
+        <w:t>// FIX — solo activa si el nombre del subdistrito contiene 'centro hist'</w:t>
+        <w:br/>
+        <w:t>const esCentroHist = sub2.includes('centro hist');</w:t>
+      </w:r>
+    </w:p>
+    <w:p>
+      <w:pPr>
+        <w:spacing w:after="100"/>
+      </w:pPr>
+      <w:r>
+        <w:t xml:space="preserve">El Centro Histórico real (D1-SD05) tiene </w:t>
+      </w:r>
+      <w:r>
+        <w:rPr>
+          <w:rFonts w:ascii="Courier New" w:hAnsi="Courier New"/>
+          <w:sz w:val="18"/>
+        </w:rPr>
+        <w:t>sub2='CENTRO HISTORICO'</w:t>
+      </w:r>
+      <w:r>
+        <w:t xml:space="preserve"> → pasa el filtro. Además, en predios del Centro Histórico la capa </w:t>
+      </w:r>
+      <w:r>
+        <w:rPr>
+          <w:rFonts w:ascii="Courier New" w:hAnsi="Courier New"/>
+          <w:sz w:val="18"/>
+        </w:rPr>
+        <w:t>PatrimonioLevantamiento</w:t>
+      </w:r>
+      <w:r>
+        <w:t xml:space="preserve"> siempre devuelve features (rama directa), por lo que el fallback de </w:t>
+      </w:r>
+      <w:r>
+        <w:rPr>
+          <w:rFonts w:ascii="Courier New" w:hAnsi="Courier New"/>
+          <w:sz w:val="18"/>
+        </w:rPr>
+        <w:t>esCentroHist</w:t>
+      </w:r>
+      <w:r>
+        <w:t xml:space="preserve"> es redundante pero correcto como respaldo.</w:t>
+      </w:r>
+    </w:p>
+    <w:p>
+      <w:pPr>
+        <w:spacing w:after="100"/>
+      </w:pPr>
+      <w:r>
+        <w:t xml:space="preserve">Scripts: </w:t>
+      </w:r>
+      <w:r>
+        <w:rPr>
+          <w:rFonts w:ascii="Courier New" w:hAnsi="Courier New"/>
+          <w:sz w:val="18"/>
+        </w:rPr>
+        <w:t>fix_centro_hist_m01.py</w:t>
+      </w:r>
+      <w:r>
+        <w:t xml:space="preserve"> · </w:t>
+      </w:r>
+      <w:r>
+        <w:rPr>
+          <w:rFonts w:ascii="Courier New" w:hAnsi="Courier New"/>
+          <w:sz w:val="18"/>
+        </w:rPr>
+        <w:t>fix_centro_hist_m10.py</w:t>
+      </w:r>
+    </w:p>
+    <w:p>
+      <w:pPr>
+        <w:spacing w:after="100"/>
+      </w:pPr>
+      <w:r>
+        <w:rPr>
+          <w:b/>
+        </w:rPr>
+        <w:t>Commit:</w:t>
+      </w:r>
+      <w:r>
+        <w:t xml:space="preserve"> </w:t>
+      </w:r>
+      <w:r>
+        <w:rPr>
+          <w:rFonts w:ascii="Courier New" w:hAnsi="Courier New"/>
+          <w:sz w:val="18"/>
+        </w:rPr>
+        <w:t>c927da6</w:t>
+      </w:r>
+    </w:p>
+    <w:p>
+      <w:pPr>
+        <w:pBdr>
+          <w:bottom w:val="single" w:sz="4" w:space="1" w:color="BBBBBB"/>
+        </w:pBdr>
+        <w:spacing w:before="0" w:after="160"/>
+      </w:pPr>
+    </w:p>
+    <w:p>
+      <w:pPr>
+        <w:pStyle w:val="Heading2"/>
+      </w:pPr>
+      <w:r>
+        <w:t>14. Auditoría completa de subdistritos GDL (sesión 15 ago 2026)</w:t>
+      </w:r>
+    </w:p>
+    <w:p>
+      <w:pPr>
+        <w:pStyle w:val="Heading3"/>
+      </w:pPr>
+      <w:r>
+        <w:t>14.1 Metodología</w:t>
+      </w:r>
+    </w:p>
+    <w:p>
+      <w:pPr>
+        <w:spacing w:after="100"/>
+      </w:pPr>
+      <w:r>
+        <w:t xml:space="preserve">Script </w:t>
+      </w:r>
+      <w:r>
+        <w:rPr>
+          <w:rFonts w:ascii="Courier New" w:hAnsi="Courier New"/>
+          <w:sz w:val="18"/>
+        </w:rPr>
+        <w:t>audit_subdistritos.py</w:t>
+      </w:r>
+      <w:r>
+        <w:t xml:space="preserve">: cuadrícula 15×15 sobre GDL (lat 20.605–20.745, lng -103.405 a -103.265, paso 0.010°). Para cada </w:t>
+      </w:r>
+      <w:r>
+        <w:rPr>
+          <w:rFonts w:ascii="Courier New" w:hAnsi="Courier New"/>
+          <w:sz w:val="18"/>
+        </w:rPr>
+        <w:t>dis_sub</w:t>
+      </w:r>
+      <w:r>
+        <w:t xml:space="preserve"> único encontrado, se consultaron </w:t>
+      </w:r>
+      <w:r>
+        <w:rPr>
+          <w:rFonts w:ascii="Courier New" w:hAnsi="Courier New"/>
+          <w:sz w:val="18"/>
+        </w:rPr>
+        <w:t>PatrimonioLevantamiento</w:t>
+      </w:r>
+      <w:r>
+        <w:t xml:space="preserve"> y </w:t>
+      </w:r>
+      <w:r>
+        <w:rPr>
+          <w:rFonts w:ascii="Courier New" w:hAnsi="Courier New"/>
+          <w:sz w:val="18"/>
+        </w:rPr>
+        <w:t>PIUESyBarrios</w:t>
+      </w:r>
+      <w:r>
+        <w:t xml:space="preserve"> (delta 0.003°).</w:t>
+      </w:r>
+    </w:p>
+    <w:p>
+      <w:pPr>
+        <w:spacing w:after="100"/>
+      </w:pPr>
+      <w:r>
+        <w:rPr>
+          <w:b/>
+        </w:rPr>
+        <w:t>Total subdistritos escaneados: 51</w:t>
+      </w:r>
+      <w:r>
+        <w:t xml:space="preserve"> (7 distritos × 7–10 subdistritos cada uno).</w:t>
+      </w:r>
+    </w:p>
+    <w:p>
+      <w:pPr>
+        <w:pStyle w:val="Heading3"/>
+      </w:pPr>
+      <w:r>
+        <w:t>14.2 Falsos positivos corregidos (lógica vieja → lógica nueva)</w:t>
+      </w:r>
+    </w:p>
+    <w:tbl>
+      <w:tblPr>
+        <w:tblStyle w:val="TableGrid"/>
+        <w:tblW w:type="auto" w:w="0"/>
+        <w:tblLook w:firstColumn="1" w:firstRow="1" w:lastColumn="0" w:lastRow="0" w:noHBand="0" w:noVBand="1" w:val="04A0"/>
+      </w:tblPr>
+      <w:tblGrid>
+        <w:gridCol w:w="1881"/>
+        <w:gridCol w:w="1881"/>
+        <w:gridCol w:w="1881"/>
+        <w:gridCol w:w="1881"/>
+        <w:gridCol w:w="1881"/>
+      </w:tblGrid>
+      <w:tr>
+        <w:tc>
+          <w:tcPr>
+            <w:tcW w:type="dxa" w:w="1881"/>
+          </w:tcPr>
+          <w:p>
+            <w:pPr>
+              <w:spacing w:before="20" w:after="20"/>
+            </w:pPr>
+            <w:r>
+              <w:rPr>
+                <w:b/>
+              </w:rPr>
+              <w:t>dis_sub</w:t>
+            </w:r>
+          </w:p>
+        </w:tc>
+        <w:tc>
+          <w:tcPr>
+            <w:tcW w:type="dxa" w:w="1881"/>
+          </w:tcPr>
+          <w:p>
+            <w:pPr>
+              <w:spacing w:before="20" w:after="20"/>
+            </w:pPr>
+            <w:r>
+              <w:rPr>
+                <w:b/>
+              </w:rPr>
+              <w:t>Nombre</w:t>
+            </w:r>
+          </w:p>
+        </w:tc>
+        <w:tc>
+          <w:tcPr>
+            <w:tcW w:type="dxa" w:w="1881"/>
+          </w:tcPr>
+          <w:p>
+            <w:pPr>
+              <w:spacing w:before="20" w:after="20"/>
+            </w:pPr>
+            <w:r>
+              <w:rPr>
+                <w:b/>
+              </w:rPr>
+              <w:t>Pat</w:t>
+            </w:r>
+          </w:p>
+        </w:tc>
+        <w:tc>
+          <w:tcPr>
+            <w:tcW w:type="dxa" w:w="1881"/>
+          </w:tcPr>
+          <w:p>
+            <w:pPr>
+              <w:spacing w:before="20" w:after="20"/>
+            </w:pPr>
+            <w:r>
+              <w:rPr>
+                <w:b/>
+              </w:rPr>
+              <w:t>PIUE</w:t>
+            </w:r>
+          </w:p>
+        </w:tc>
+        <w:tc>
+          <w:tcPr>
+            <w:tcW w:type="dxa" w:w="1881"/>
+          </w:tcPr>
+          <w:p>
+            <w:pPr>
+              <w:spacing w:before="20" w:after="20"/>
+            </w:pPr>
+            <w:r>
+              <w:rPr>
+                <w:b/>
+              </w:rPr>
+              <w:t>Resultado corregido</w:t>
+            </w:r>
+          </w:p>
+        </w:tc>
+      </w:tr>
+      <w:tr>
+        <w:tc>
+          <w:tcPr>
+            <w:tcW w:type="dxa" w:w="1881"/>
+          </w:tcPr>
+          <w:p>
+            <w:pPr>
+              <w:spacing w:before="20" w:after="20"/>
+            </w:pPr>
+            <w:r>
+              <w:t>D2SD05</w:t>
+            </w:r>
+          </w:p>
+        </w:tc>
+        <w:tc>
+          <w:tcPr>
+            <w:tcW w:type="dxa" w:w="1881"/>
+          </w:tcPr>
+          <w:p>
+            <w:pPr>
+              <w:spacing w:before="20" w:after="20"/>
+            </w:pPr>
+            <w:r>
+              <w:t>COLINAS DE SAN JAVIER</w:t>
+            </w:r>
+          </w:p>
+        </w:tc>
+        <w:tc>
+          <w:tcPr>
+            <w:tcW w:type="dxa" w:w="1881"/>
+          </w:tcPr>
+          <w:p>
+            <w:pPr>
+              <w:spacing w:before="20" w:after="20"/>
+            </w:pPr>
+            <w:r>
+              <w:t>0</w:t>
+            </w:r>
+          </w:p>
+        </w:tc>
+        <w:tc>
+          <w:tcPr>
+            <w:tcW w:type="dxa" w:w="1881"/>
+          </w:tcPr>
+          <w:p>
+            <w:pPr>
+              <w:spacing w:before="20" w:after="20"/>
+            </w:pPr>
+            <w:r>
+              <w:t>0</w:t>
+            </w:r>
+          </w:p>
+        </w:tc>
+        <w:tc>
+          <w:tcPr>
+            <w:tcW w:type="dxa" w:w="1881"/>
+          </w:tcPr>
+          <w:p>
+            <w:pPr>
+              <w:spacing w:before="20" w:after="20"/>
+            </w:pPr>
+            <w:r>
+              <w:t>⚪ Sin restricción</w:t>
+            </w:r>
+          </w:p>
+        </w:tc>
+      </w:tr>
+      <w:tr>
+        <w:tc>
+          <w:tcPr>
+            <w:tcW w:type="dxa" w:w="1881"/>
+          </w:tcPr>
+          <w:p>
+            <w:pPr>
+              <w:spacing w:before="20" w:after="20"/>
+            </w:pPr>
+            <w:r>
+              <w:t>D3SD05</w:t>
+            </w:r>
+          </w:p>
+        </w:tc>
+        <w:tc>
+          <w:tcPr>
+            <w:tcW w:type="dxa" w:w="1881"/>
+          </w:tcPr>
+          <w:p>
+            <w:pPr>
+              <w:spacing w:before="20" w:after="20"/>
+            </w:pPr>
+            <w:r>
+              <w:t>LA FEDERACHA</w:t>
+            </w:r>
+          </w:p>
+        </w:tc>
+        <w:tc>
+          <w:tcPr>
+            <w:tcW w:type="dxa" w:w="1881"/>
+          </w:tcPr>
+          <w:p>
+            <w:pPr>
+              <w:spacing w:before="20" w:after="20"/>
+            </w:pPr>
+            <w:r>
+              <w:t>0</w:t>
+            </w:r>
+          </w:p>
+        </w:tc>
+        <w:tc>
+          <w:tcPr>
+            <w:tcW w:type="dxa" w:w="1881"/>
+          </w:tcPr>
+          <w:p>
+            <w:pPr>
+              <w:spacing w:before="20" w:after="20"/>
+            </w:pPr>
+            <w:r>
+              <w:t>0</w:t>
+            </w:r>
+          </w:p>
+        </w:tc>
+        <w:tc>
+          <w:tcPr>
+            <w:tcW w:type="dxa" w:w="1881"/>
+          </w:tcPr>
+          <w:p>
+            <w:pPr>
+              <w:spacing w:before="20" w:after="20"/>
+            </w:pPr>
+            <w:r>
+              <w:t>⚪ Sin restricción</w:t>
+            </w:r>
+          </w:p>
+        </w:tc>
+      </w:tr>
+      <w:tr>
+        <w:tc>
+          <w:tcPr>
+            <w:tcW w:type="dxa" w:w="1881"/>
+          </w:tcPr>
+          <w:p>
+            <w:pPr>
+              <w:spacing w:before="20" w:after="20"/>
+            </w:pPr>
+            <w:r>
+              <w:t>D4SD05</w:t>
+            </w:r>
+          </w:p>
+        </w:tc>
+        <w:tc>
+          <w:tcPr>
+            <w:tcW w:type="dxa" w:w="1881"/>
+          </w:tcPr>
+          <w:p>
+            <w:pPr>
+              <w:spacing w:before="20" w:after="20"/>
+            </w:pPr>
+            <w:r>
+              <w:t>ORIENTE</w:t>
+            </w:r>
+          </w:p>
+        </w:tc>
+        <w:tc>
+          <w:tcPr>
+            <w:tcW w:type="dxa" w:w="1881"/>
+          </w:tcPr>
+          <w:p>
+            <w:pPr>
+              <w:spacing w:before="20" w:after="20"/>
+            </w:pPr>
+            <w:r>
+              <w:t>0</w:t>
+            </w:r>
+          </w:p>
+        </w:tc>
+        <w:tc>
+          <w:tcPr>
+            <w:tcW w:type="dxa" w:w="1881"/>
+          </w:tcPr>
+          <w:p>
+            <w:pPr>
+              <w:spacing w:before="20" w:after="20"/>
+            </w:pPr>
+            <w:r>
+              <w:t>0</w:t>
+            </w:r>
+          </w:p>
+        </w:tc>
+        <w:tc>
+          <w:tcPr>
+            <w:tcW w:type="dxa" w:w="1881"/>
+          </w:tcPr>
+          <w:p>
+            <w:pPr>
+              <w:spacing w:before="20" w:after="20"/>
+            </w:pPr>
+            <w:r>
+              <w:t>⚪ Sin restricción</w:t>
+            </w:r>
+          </w:p>
+        </w:tc>
+      </w:tr>
+      <w:tr>
+        <w:tc>
+          <w:tcPr>
+            <w:tcW w:type="dxa" w:w="1881"/>
+          </w:tcPr>
+          <w:p>
+            <w:pPr>
+              <w:spacing w:before="20" w:after="20"/>
+            </w:pPr>
+            <w:r>
+              <w:t>D7SD05</w:t>
+            </w:r>
+          </w:p>
+        </w:tc>
+        <w:tc>
+          <w:tcPr>
+            <w:tcW w:type="dxa" w:w="1881"/>
+          </w:tcPr>
+          <w:p>
+            <w:pPr>
+              <w:spacing w:before="20" w:after="20"/>
+            </w:pPr>
+            <w:r>
+              <w:t>ÁLAMO - LA NOGALERA</w:t>
+            </w:r>
+          </w:p>
+        </w:tc>
+        <w:tc>
+          <w:tcPr>
+            <w:tcW w:type="dxa" w:w="1881"/>
+          </w:tcPr>
+          <w:p>
+            <w:pPr>
+              <w:spacing w:before="20" w:after="20"/>
+            </w:pPr>
+            <w:r>
+              <w:t>0</w:t>
+            </w:r>
+          </w:p>
+        </w:tc>
+        <w:tc>
+          <w:tcPr>
+            <w:tcW w:type="dxa" w:w="1881"/>
+          </w:tcPr>
+          <w:p>
+            <w:pPr>
+              <w:spacing w:before="20" w:after="20"/>
+            </w:pPr>
+            <w:r>
+              <w:t>0</w:t>
+            </w:r>
+          </w:p>
+        </w:tc>
+        <w:tc>
+          <w:tcPr>
+            <w:tcW w:type="dxa" w:w="1881"/>
+          </w:tcPr>
+          <w:p>
+            <w:pPr>
+              <w:spacing w:before="20" w:after="20"/>
+            </w:pPr>
+            <w:r>
+              <w:t>⚪ Sin restricción</w:t>
+            </w:r>
+          </w:p>
+        </w:tc>
+      </w:tr>
+    </w:tbl>
+    <w:p/>
+    <w:p>
+      <w:pPr>
+        <w:pStyle w:val="Heading3"/>
+      </w:pPr>
+      <w:r>
+        <w:t>14.3 Subdistritos con patrimonio real detectado correctamente</w:t>
+      </w:r>
+    </w:p>
+    <w:tbl>
+      <w:tblPr>
+        <w:tblStyle w:val="TableGrid"/>
+        <w:tblW w:type="auto" w:w="0"/>
+        <w:tblLook w:firstColumn="1" w:firstRow="1" w:lastColumn="0" w:lastRow="0" w:noHBand="0" w:noVBand="1" w:val="04A0"/>
+      </w:tblPr>
+      <w:tblGrid>
+        <w:gridCol w:w="3135"/>
+        <w:gridCol w:w="3135"/>
+        <w:gridCol w:w="3135"/>
+      </w:tblGrid>
+      <w:tr>
+        <w:tc>
+          <w:tcPr>
+            <w:tcW w:type="dxa" w:w="3135"/>
+          </w:tcPr>
+          <w:p>
+            <w:pPr>
+              <w:spacing w:before="20" w:after="20"/>
+            </w:pPr>
+            <w:r>
+              <w:rPr>
+                <w:b/>
+              </w:rPr>
+              <w:t>dis_sub</w:t>
+            </w:r>
+          </w:p>
+        </w:tc>
+        <w:tc>
+          <w:tcPr>
+            <w:tcW w:type="dxa" w:w="3135"/>
+          </w:tcPr>
+          <w:p>
+            <w:pPr>
+              <w:spacing w:before="20" w:after="20"/>
+            </w:pPr>
+            <w:r>
+              <w:rPr>
+                <w:b/>
+              </w:rPr>
+              <w:t>Nombre</w:t>
+            </w:r>
+          </w:p>
+        </w:tc>
+        <w:tc>
+          <w:tcPr>
+            <w:tcW w:type="dxa" w:w="3135"/>
+          </w:tcPr>
+          <w:p>
+            <w:pPr>
+              <w:spacing w:before="20" w:after="20"/>
+            </w:pPr>
+            <w:r>
+              <w:rPr>
+                <w:b/>
+              </w:rPr>
+              <w:t>Clasificación / PIUE</w:t>
+            </w:r>
+          </w:p>
+        </w:tc>
+      </w:tr>
+      <w:tr>
+        <w:tc>
+          <w:tcPr>
+            <w:tcW w:type="dxa" w:w="3135"/>
+          </w:tcPr>
+          <w:p>
+            <w:pPr>
+              <w:spacing w:before="20" w:after="20"/>
+            </w:pPr>
+            <w:r>
+              <w:t>D1SD02</w:t>
+            </w:r>
+          </w:p>
+        </w:tc>
+        <w:tc>
+          <w:tcPr>
+            <w:tcW w:type="dxa" w:w="3135"/>
+          </w:tcPr>
+          <w:p>
+            <w:pPr>
+              <w:spacing w:before="20" w:after="20"/>
+            </w:pPr>
+            <w:r>
+              <w:t>Colinas de la Normal</w:t>
+            </w:r>
+          </w:p>
+        </w:tc>
+        <w:tc>
+          <w:tcPr>
+            <w:tcW w:type="dxa" w:w="3135"/>
+          </w:tcPr>
+          <w:p>
+            <w:pPr>
+              <w:spacing w:before="20" w:after="20"/>
+            </w:pPr>
+            <w:r>
+              <w:t>inmueble de valor artístico relevante · 4. La Normal Perímetro B</w:t>
+            </w:r>
+          </w:p>
+        </w:tc>
+      </w:tr>
+      <w:tr>
+        <w:tc>
+          <w:tcPr>
+            <w:tcW w:type="dxa" w:w="3135"/>
+          </w:tcPr>
+          <w:p>
+            <w:pPr>
+              <w:spacing w:before="20" w:after="20"/>
+            </w:pPr>
+            <w:r>
+              <w:t>D1SD03</w:t>
+            </w:r>
+          </w:p>
+        </w:tc>
+        <w:tc>
+          <w:tcPr>
+            <w:tcW w:type="dxa" w:w="3135"/>
+          </w:tcPr>
+          <w:p>
+            <w:pPr>
+              <w:spacing w:before="20" w:after="20"/>
+            </w:pPr>
+            <w:r>
+              <w:t>Centro Médico</w:t>
+            </w:r>
+          </w:p>
+        </w:tc>
+        <w:tc>
+          <w:tcPr>
+            <w:tcW w:type="dxa" w:w="3135"/>
+          </w:tcPr>
+          <w:p>
+            <w:pPr>
+              <w:spacing w:before="20" w:after="20"/>
+            </w:pPr>
+            <w:r>
+              <w:t>5. Distrito Salud</w:t>
+            </w:r>
+          </w:p>
+        </w:tc>
+      </w:tr>
+      <w:tr>
+        <w:tc>
+          <w:tcPr>
+            <w:tcW w:type="dxa" w:w="3135"/>
+          </w:tcPr>
+          <w:p>
+            <w:pPr>
+              <w:spacing w:before="20" w:after="20"/>
+            </w:pPr>
+            <w:r>
+              <w:t>D1SD04</w:t>
+            </w:r>
+          </w:p>
+        </w:tc>
+        <w:tc>
+          <w:tcPr>
+            <w:tcW w:type="dxa" w:w="3135"/>
+          </w:tcPr>
+          <w:p>
+            <w:pPr>
+              <w:spacing w:before="20" w:after="20"/>
+            </w:pPr>
+            <w:r>
+              <w:t>Santa Teresita</w:t>
+            </w:r>
+          </w:p>
+        </w:tc>
+        <w:tc>
+          <w:tcPr>
+            <w:tcW w:type="dxa" w:w="3135"/>
+          </w:tcPr>
+          <w:p>
+            <w:pPr>
+              <w:spacing w:before="20" w:after="20"/>
+            </w:pPr>
+            <w:r>
+              <w:t>artístico relevante + no armónica · 18. Chapultepec Perímetro B</w:t>
+            </w:r>
+          </w:p>
+        </w:tc>
+      </w:tr>
+      <w:tr>
+        <w:tc>
+          <w:tcPr>
+            <w:tcW w:type="dxa" w:w="3135"/>
+          </w:tcPr>
+          <w:p>
+            <w:pPr>
+              <w:spacing w:before="20" w:after="20"/>
+            </w:pPr>
+            <w:r>
+              <w:t>D1SD05</w:t>
+            </w:r>
+          </w:p>
+        </w:tc>
+        <w:tc>
+          <w:tcPr>
+            <w:tcW w:type="dxa" w:w="3135"/>
+          </w:tcPr>
+          <w:p>
+            <w:pPr>
+              <w:spacing w:before="20" w:after="20"/>
+            </w:pPr>
+            <w:r>
+              <w:t>Centro Histórico</w:t>
+            </w:r>
+          </w:p>
+        </w:tc>
+        <w:tc>
+          <w:tcPr>
+            <w:tcW w:type="dxa" w:w="3135"/>
+          </w:tcPr>
+          <w:p>
+            <w:pPr>
+              <w:spacing w:before="20" w:after="20"/>
+            </w:pPr>
+            <w:r>
+              <w:t>múltiples · 6. Corredor Alcalde - Centro Histórico Perímetro A</w:t>
+            </w:r>
+          </w:p>
+        </w:tc>
+      </w:tr>
+      <w:tr>
+        <w:tc>
+          <w:tcPr>
+            <w:tcW w:type="dxa" w:w="3135"/>
+          </w:tcPr>
+          <w:p>
+            <w:pPr>
+              <w:spacing w:before="20" w:after="20"/>
+            </w:pPr>
+            <w:r>
+              <w:t>D1SD06</w:t>
+            </w:r>
+          </w:p>
+        </w:tc>
+        <w:tc>
+          <w:tcPr>
+            <w:tcW w:type="dxa" w:w="3135"/>
+          </w:tcPr>
+          <w:p>
+            <w:pPr>
+              <w:spacing w:before="20" w:after="20"/>
+            </w:pPr>
+            <w:r>
+              <w:t>Analco</w:t>
+            </w:r>
+          </w:p>
+        </w:tc>
+        <w:tc>
+          <w:tcPr>
+            <w:tcW w:type="dxa" w:w="3135"/>
+          </w:tcPr>
+          <w:p>
+            <w:pPr>
+              <w:spacing w:before="20" w:after="20"/>
+            </w:pPr>
+            <w:r>
+              <w:t>armónica + ambiental · 8. Analco Perímetro B</w:t>
+            </w:r>
+          </w:p>
+        </w:tc>
+      </w:tr>
+      <w:tr>
+        <w:tc>
+          <w:tcPr>
+            <w:tcW w:type="dxa" w:w="3135"/>
+          </w:tcPr>
+          <w:p>
+            <w:pPr>
+              <w:spacing w:before="20" w:after="20"/>
+            </w:pPr>
+            <w:r>
+              <w:t>D1SD07</w:t>
+            </w:r>
+          </w:p>
+        </w:tc>
+        <w:tc>
+          <w:tcPr>
+            <w:tcW w:type="dxa" w:w="3135"/>
+          </w:tcPr>
+          <w:p>
+            <w:pPr>
+              <w:spacing w:before="20" w:after="20"/>
+            </w:pPr>
+            <w:r>
+              <w:t>La Moderna</w:t>
+            </w:r>
+          </w:p>
+        </w:tc>
+        <w:tc>
+          <w:tcPr>
+            <w:tcW w:type="dxa" w:w="3135"/>
+          </w:tcPr>
+          <w:p>
+            <w:pPr>
+              <w:spacing w:before="20" w:after="20"/>
+            </w:pPr>
+            <w:r>
+              <w:t>armónica + ambiental · 18. Chapultepec Perímetro B</w:t>
+            </w:r>
+          </w:p>
+        </w:tc>
+      </w:tr>
+      <w:tr>
+        <w:tc>
+          <w:tcPr>
+            <w:tcW w:type="dxa" w:w="3135"/>
+          </w:tcPr>
+          <w:p>
+            <w:pPr>
+              <w:spacing w:before="20" w:after="20"/>
+            </w:pPr>
+            <w:r>
+              <w:t>D1SD08</w:t>
+            </w:r>
+          </w:p>
+        </w:tc>
+        <w:tc>
+          <w:tcPr>
+            <w:tcW w:type="dxa" w:w="3135"/>
+          </w:tcPr>
+          <w:p>
+            <w:pPr>
+              <w:spacing w:before="20" w:after="20"/>
+            </w:pPr>
+            <w:r>
+              <w:t>Agua Azul</w:t>
+            </w:r>
+          </w:p>
+        </w:tc>
+        <w:tc>
+          <w:tcPr>
+            <w:tcW w:type="dxa" w:w="3135"/>
+          </w:tcPr>
+          <w:p>
+            <w:pPr>
+              <w:spacing w:before="20" w:after="20"/>
+            </w:pPr>
+            <w:r>
+              <w:t>12. Agua Azul - Central camionera</w:t>
+            </w:r>
+          </w:p>
+        </w:tc>
+      </w:tr>
+      <w:tr>
+        <w:tc>
+          <w:tcPr>
+            <w:tcW w:type="dxa" w:w="3135"/>
+          </w:tcPr>
+          <w:p>
+            <w:pPr>
+              <w:spacing w:before="20" w:after="20"/>
+            </w:pPr>
+            <w:r>
+              <w:t>D2SD03</w:t>
+            </w:r>
+          </w:p>
+        </w:tc>
+        <w:tc>
+          <w:tcPr>
+            <w:tcW w:type="dxa" w:w="3135"/>
+          </w:tcPr>
+          <w:p>
+            <w:pPr>
+              <w:spacing w:before="20" w:after="20"/>
+            </w:pPr>
+            <w:r>
+              <w:t>Country</w:t>
+            </w:r>
+          </w:p>
+        </w:tc>
+        <w:tc>
+          <w:tcPr>
+            <w:tcW w:type="dxa" w:w="3135"/>
+          </w:tcPr>
+          <w:p>
+            <w:pPr>
+              <w:spacing w:before="20" w:after="20"/>
+            </w:pPr>
+            <w:r>
+              <w:t>22. Corredor Ávila Camacho</w:t>
+            </w:r>
+          </w:p>
+        </w:tc>
+      </w:tr>
+      <w:tr>
+        <w:tc>
+          <w:tcPr>
+            <w:tcW w:type="dxa" w:w="3135"/>
+          </w:tcPr>
+          <w:p>
+            <w:pPr>
+              <w:spacing w:before="20" w:after="20"/>
+            </w:pPr>
+            <w:r>
+              <w:t>D2SD04</w:t>
+            </w:r>
+          </w:p>
+        </w:tc>
+        <w:tc>
+          <w:tcPr>
+            <w:tcW w:type="dxa" w:w="3135"/>
+          </w:tcPr>
+          <w:p>
+            <w:pPr>
+              <w:spacing w:before="20" w:after="20"/>
+            </w:pPr>
+            <w:r>
+              <w:t>Jardines del Country - Atemajac</w:t>
+            </w:r>
+          </w:p>
+        </w:tc>
+        <w:tc>
+          <w:tcPr>
+            <w:tcW w:type="dxa" w:w="3135"/>
+          </w:tcPr>
+          <w:p>
+            <w:pPr>
+              <w:spacing w:before="20" w:after="20"/>
+            </w:pPr>
+            <w:r>
+              <w:t>monumento histórico civil · Atemajac</w:t>
+            </w:r>
+          </w:p>
+        </w:tc>
+      </w:tr>
+      <w:tr>
+        <w:tc>
+          <w:tcPr>
+            <w:tcW w:type="dxa" w:w="3135"/>
+          </w:tcPr>
+          <w:p>
+            <w:pPr>
+              <w:spacing w:before="20" w:after="20"/>
+            </w:pPr>
+            <w:r>
+              <w:t>D2SD07</w:t>
+            </w:r>
+          </w:p>
+        </w:tc>
+        <w:tc>
+          <w:tcPr>
+            <w:tcW w:type="dxa" w:w="3135"/>
+          </w:tcPr>
+          <w:p>
+            <w:pPr>
+              <w:spacing w:before="20" w:after="20"/>
+            </w:pPr>
+            <w:r>
+              <w:t>Arcos - Ladrón de Guevara</w:t>
+            </w:r>
+          </w:p>
+        </w:tc>
+        <w:tc>
+          <w:tcPr>
+            <w:tcW w:type="dxa" w:w="3135"/>
+          </w:tcPr>
+          <w:p>
+            <w:pPr>
+              <w:spacing w:before="20" w:after="20"/>
+            </w:pPr>
+            <w:r>
+              <w:t>armónica · 19. Minerva Perímetro B</w:t>
+            </w:r>
+          </w:p>
+        </w:tc>
+      </w:tr>
+      <w:tr>
+        <w:tc>
+          <w:tcPr>
+            <w:tcW w:type="dxa" w:w="3135"/>
+          </w:tcPr>
+          <w:p>
+            <w:pPr>
+              <w:spacing w:before="20" w:after="20"/>
+            </w:pPr>
+            <w:r>
+              <w:t>D2SD08</w:t>
+            </w:r>
+          </w:p>
+        </w:tc>
+        <w:tc>
+          <w:tcPr>
+            <w:tcW w:type="dxa" w:w="3135"/>
+          </w:tcPr>
+          <w:p>
+            <w:pPr>
+              <w:spacing w:before="20" w:after="20"/>
+            </w:pPr>
+            <w:r>
+              <w:t>Chapalita</w:t>
+            </w:r>
+          </w:p>
+        </w:tc>
+        <w:tc>
+          <w:tcPr>
+            <w:tcW w:type="dxa" w:w="3135"/>
+          </w:tcPr>
+          <w:p>
+            <w:pPr>
+              <w:spacing w:before="20" w:after="20"/>
+            </w:pPr>
+            <w:r>
+              <w:t>21. Corredor Mariano Otero - Plaza del Sol</w:t>
+            </w:r>
+          </w:p>
+        </w:tc>
+      </w:tr>
+      <w:tr>
+        <w:tc>
+          <w:tcPr>
+            <w:tcW w:type="dxa" w:w="3135"/>
+          </w:tcPr>
+          <w:p>
+            <w:pPr>
+              <w:spacing w:before="20" w:after="20"/>
+            </w:pPr>
+            <w:r>
+              <w:t>D2SD09</w:t>
+            </w:r>
+          </w:p>
+        </w:tc>
+        <w:tc>
+          <w:tcPr>
+            <w:tcW w:type="dxa" w:w="3135"/>
+          </w:tcPr>
+          <w:p>
+            <w:pPr>
+              <w:spacing w:before="20" w:after="20"/>
+            </w:pPr>
+            <w:r>
+              <w:t>Jardines del Bosque</w:t>
+            </w:r>
+          </w:p>
+        </w:tc>
+        <w:tc>
+          <w:tcPr>
+            <w:tcW w:type="dxa" w:w="3135"/>
+          </w:tcPr>
+          <w:p>
+            <w:pPr>
+              <w:spacing w:before="20" w:after="20"/>
+            </w:pPr>
+            <w:r>
+              <w:t>armónica · Jardines del Bosque</w:t>
+            </w:r>
+          </w:p>
+        </w:tc>
+      </w:tr>
+      <w:tr>
+        <w:tc>
+          <w:tcPr>
+            <w:tcW w:type="dxa" w:w="3135"/>
+          </w:tcPr>
+          <w:p>
+            <w:pPr>
+              <w:spacing w:before="20" w:after="20"/>
+            </w:pPr>
+            <w:r>
+              <w:t>D3SD01</w:t>
+            </w:r>
+          </w:p>
+        </w:tc>
+        <w:tc>
+          <w:tcPr>
+            <w:tcW w:type="dxa" w:w="3135"/>
+          </w:tcPr>
+          <w:p>
+            <w:pPr>
+              <w:spacing w:before="20" w:after="20"/>
+            </w:pPr>
+            <w:r>
+              <w:t>Huentitán el Bajo</w:t>
+            </w:r>
+          </w:p>
+        </w:tc>
+        <w:tc>
+          <w:tcPr>
+            <w:tcW w:type="dxa" w:w="3135"/>
+          </w:tcPr>
+          <w:p>
+            <w:pPr>
+              <w:spacing w:before="20" w:after="20"/>
+            </w:pPr>
+            <w:r>
+              <w:t>1. Huentitán</w:t>
+            </w:r>
+          </w:p>
+        </w:tc>
+      </w:tr>
+      <w:tr>
+        <w:tc>
+          <w:tcPr>
+            <w:tcW w:type="dxa" w:w="3135"/>
+          </w:tcPr>
+          <w:p>
+            <w:pPr>
+              <w:spacing w:before="20" w:after="20"/>
+            </w:pPr>
+            <w:r>
+              <w:t>D3SD02</w:t>
+            </w:r>
+          </w:p>
+        </w:tc>
+        <w:tc>
+          <w:tcPr>
+            <w:tcW w:type="dxa" w:w="3135"/>
+          </w:tcPr>
+          <w:p>
+            <w:pPr>
+              <w:spacing w:before="20" w:after="20"/>
+            </w:pPr>
+            <w:r>
+              <w:t>Zoológico</w:t>
+            </w:r>
+          </w:p>
+        </w:tc>
+        <w:tc>
+          <w:tcPr>
+            <w:tcW w:type="dxa" w:w="3135"/>
+          </w:tcPr>
+          <w:p>
+            <w:pPr>
+              <w:spacing w:before="20" w:after="20"/>
+            </w:pPr>
+            <w:r>
+              <w:t>1. Huentitán</w:t>
+            </w:r>
+          </w:p>
+        </w:tc>
+      </w:tr>
+      <w:tr>
+        <w:tc>
+          <w:tcPr>
+            <w:tcW w:type="dxa" w:w="3135"/>
+          </w:tcPr>
+          <w:p>
+            <w:pPr>
+              <w:spacing w:before="20" w:after="20"/>
+            </w:pPr>
+            <w:r>
+              <w:t>D3SD03</w:t>
+            </w:r>
+          </w:p>
+        </w:tc>
+        <w:tc>
+          <w:tcPr>
+            <w:tcW w:type="dxa" w:w="3135"/>
+          </w:tcPr>
+          <w:p>
+            <w:pPr>
+              <w:spacing w:before="20" w:after="20"/>
+            </w:pPr>
+            <w:r>
+              <w:t>Lomas del Paraíso</w:t>
+            </w:r>
+          </w:p>
+        </w:tc>
+        <w:tc>
+          <w:tcPr>
+            <w:tcW w:type="dxa" w:w="3135"/>
+          </w:tcPr>
+          <w:p>
+            <w:pPr>
+              <w:spacing w:before="20" w:after="20"/>
+            </w:pPr>
+            <w:r>
+              <w:t>2. Canal de Atemajac</w:t>
+            </w:r>
+          </w:p>
+        </w:tc>
+      </w:tr>
+      <w:tr>
+        <w:tc>
+          <w:tcPr>
+            <w:tcW w:type="dxa" w:w="3135"/>
+          </w:tcPr>
+          <w:p>
+            <w:pPr>
+              <w:spacing w:before="20" w:after="20"/>
+            </w:pPr>
+            <w:r>
+              <w:t>D3SD04</w:t>
+            </w:r>
+          </w:p>
+        </w:tc>
+        <w:tc>
+          <w:tcPr>
+            <w:tcW w:type="dxa" w:w="3135"/>
+          </w:tcPr>
+          <w:p>
+            <w:pPr>
+              <w:spacing w:before="20" w:after="20"/>
+            </w:pPr>
+            <w:r>
+              <w:t>Rancho Nuevo</w:t>
+            </w:r>
+          </w:p>
+        </w:tc>
+        <w:tc>
+          <w:tcPr>
+            <w:tcW w:type="dxa" w:w="3135"/>
+          </w:tcPr>
+          <w:p>
+            <w:pPr>
+              <w:spacing w:before="20" w:after="20"/>
+            </w:pPr>
+            <w:r>
+              <w:t>2. Canal de Atemajac</w:t>
+            </w:r>
+          </w:p>
+        </w:tc>
+      </w:tr>
+      <w:tr>
+        <w:tc>
+          <w:tcPr>
+            <w:tcW w:type="dxa" w:w="3135"/>
+          </w:tcPr>
+          <w:p>
+            <w:pPr>
+              <w:spacing w:before="20" w:after="20"/>
+            </w:pPr>
+            <w:r>
+              <w:t>D4SD02</w:t>
+            </w:r>
+          </w:p>
+        </w:tc>
+        <w:tc>
+          <w:tcPr>
+            <w:tcW w:type="dxa" w:w="3135"/>
+          </w:tcPr>
+          <w:p>
+            <w:pPr>
+              <w:spacing w:before="20" w:after="20"/>
+            </w:pPr>
+            <w:r>
+              <w:t>Panteón Nuevo</w:t>
+            </w:r>
+          </w:p>
+        </w:tc>
+        <w:tc>
+          <w:tcPr>
+            <w:tcW w:type="dxa" w:w="3135"/>
+          </w:tcPr>
+          <w:p>
+            <w:pPr>
+              <w:spacing w:before="20" w:after="20"/>
+            </w:pPr>
+            <w:r>
+              <w:t>inmueble de valor artístico relevante</w:t>
+            </w:r>
+          </w:p>
+        </w:tc>
+      </w:tr>
+      <w:tr>
+        <w:tc>
+          <w:tcPr>
+            <w:tcW w:type="dxa" w:w="3135"/>
+          </w:tcPr>
+          <w:p>
+            <w:pPr>
+              <w:spacing w:before="20" w:after="20"/>
+            </w:pPr>
+            <w:r>
+              <w:t>D5SD04</w:t>
+            </w:r>
+          </w:p>
+        </w:tc>
+        <w:tc>
+          <w:tcPr>
+            <w:tcW w:type="dxa" w:w="3135"/>
+          </w:tcPr>
+          <w:p>
+            <w:pPr>
+              <w:spacing w:before="20" w:after="20"/>
+            </w:pPr>
+            <w:r>
+              <w:t>San Andrés</w:t>
+            </w:r>
+          </w:p>
+        </w:tc>
+        <w:tc>
+          <w:tcPr>
+            <w:tcW w:type="dxa" w:w="3135"/>
+          </w:tcPr>
+          <w:p>
+            <w:pPr>
+              <w:spacing w:before="20" w:after="20"/>
+            </w:pPr>
+            <w:r>
+              <w:t>artístico relevante + armónica · San Andrés</w:t>
+            </w:r>
+          </w:p>
+        </w:tc>
+      </w:tr>
+      <w:tr>
+        <w:tc>
+          <w:tcPr>
+            <w:tcW w:type="dxa" w:w="3135"/>
+          </w:tcPr>
+          <w:p>
+            <w:pPr>
+              <w:spacing w:before="20" w:after="20"/>
+            </w:pPr>
+            <w:r>
+              <w:t>D5SD05</w:t>
+            </w:r>
+          </w:p>
+        </w:tc>
+        <w:tc>
+          <w:tcPr>
+            <w:tcW w:type="dxa" w:w="3135"/>
+          </w:tcPr>
+          <w:p>
+            <w:pPr>
+              <w:spacing w:before="20" w:after="20"/>
+            </w:pPr>
+            <w:r>
+              <w:t>Tecnológico</w:t>
+            </w:r>
+          </w:p>
+        </w:tc>
+        <w:tc>
+          <w:tcPr>
+            <w:tcW w:type="dxa" w:w="3135"/>
+          </w:tcPr>
+          <w:p>
+            <w:pPr>
+              <w:spacing w:before="20" w:after="20"/>
+            </w:pPr>
+            <w:r>
+              <w:t>artístico relevante · 11. Revolución - Tecnológico</w:t>
+            </w:r>
+          </w:p>
+        </w:tc>
+      </w:tr>
+      <w:tr>
+        <w:tc>
+          <w:tcPr>
+            <w:tcW w:type="dxa" w:w="3135"/>
+          </w:tcPr>
+          <w:p>
+            <w:pPr>
+              <w:spacing w:before="20" w:after="20"/>
+            </w:pPr>
+            <w:r>
+              <w:t>D5SD06</w:t>
+            </w:r>
+          </w:p>
+        </w:tc>
+        <w:tc>
+          <w:tcPr>
+            <w:tcW w:type="dxa" w:w="3135"/>
+          </w:tcPr>
+          <w:p>
+            <w:pPr>
+              <w:spacing w:before="20" w:after="20"/>
+            </w:pPr>
+            <w:r>
+              <w:t>Medrano</w:t>
+            </w:r>
+          </w:p>
+        </w:tc>
+        <w:tc>
+          <w:tcPr>
+            <w:tcW w:type="dxa" w:w="3135"/>
+          </w:tcPr>
+          <w:p>
+            <w:pPr>
+              <w:spacing w:before="20" w:after="20"/>
+            </w:pPr>
+            <w:r>
+              <w:t>11. Revolución - Tecnológico</w:t>
+            </w:r>
+          </w:p>
+        </w:tc>
+      </w:tr>
+      <w:tr>
+        <w:tc>
+          <w:tcPr>
+            <w:tcW w:type="dxa" w:w="3135"/>
+          </w:tcPr>
+          <w:p>
+            <w:pPr>
+              <w:spacing w:before="20" w:after="20"/>
+            </w:pPr>
+            <w:r>
+              <w:t>D5SD07</w:t>
+            </w:r>
+          </w:p>
+        </w:tc>
+        <w:tc>
+          <w:tcPr>
+            <w:tcW w:type="dxa" w:w="3135"/>
+          </w:tcPr>
+          <w:p>
+            <w:pPr>
+              <w:spacing w:before="20" w:after="20"/>
+            </w:pPr>
+            <w:r>
+              <w:t>González Gallo</w:t>
+            </w:r>
+          </w:p>
+        </w:tc>
+        <w:tc>
+          <w:tcPr>
+            <w:tcW w:type="dxa" w:w="3135"/>
+          </w:tcPr>
+          <w:p>
+            <w:pPr>
+              <w:spacing w:before="20" w:after="20"/>
+            </w:pPr>
+            <w:r>
+              <w:t>artístico relevante · 12. Agua Azul - Central camionera</w:t>
+            </w:r>
+          </w:p>
+        </w:tc>
+      </w:tr>
+      <w:tr>
+        <w:tc>
+          <w:tcPr>
+            <w:tcW w:type="dxa" w:w="3135"/>
+          </w:tcPr>
+          <w:p>
+            <w:pPr>
+              <w:spacing w:before="20" w:after="20"/>
+            </w:pPr>
+            <w:r>
+              <w:t>D6SD03</w:t>
+            </w:r>
+          </w:p>
+        </w:tc>
+        <w:tc>
+          <w:tcPr>
+            <w:tcW w:type="dxa" w:w="3135"/>
+          </w:tcPr>
+          <w:p>
+            <w:pPr>
+              <w:spacing w:before="20" w:after="20"/>
+            </w:pPr>
+            <w:r>
+              <w:t>San Rafael</w:t>
+            </w:r>
+          </w:p>
+        </w:tc>
+        <w:tc>
+          <w:tcPr>
+            <w:tcW w:type="dxa" w:w="3135"/>
+          </w:tcPr>
+          <w:p>
+            <w:pPr>
+              <w:spacing w:before="20" w:after="20"/>
+            </w:pPr>
+            <w:r>
+              <w:t>11. Revolución - Tecnológico</w:t>
+            </w:r>
+          </w:p>
+        </w:tc>
+      </w:tr>
+      <w:tr>
+        <w:tc>
+          <w:tcPr>
+            <w:tcW w:type="dxa" w:w="3135"/>
+          </w:tcPr>
+          <w:p>
+            <w:pPr>
+              <w:spacing w:before="20" w:after="20"/>
+            </w:pPr>
+            <w:r>
+              <w:t>D7SD04</w:t>
+            </w:r>
+          </w:p>
+        </w:tc>
+        <w:tc>
+          <w:tcPr>
+            <w:tcW w:type="dxa" w:w="3135"/>
+          </w:tcPr>
+          <w:p>
+            <w:pPr>
+              <w:spacing w:before="20" w:after="20"/>
+            </w:pPr>
+            <w:r>
+              <w:t>Zona Industrial - El Dean</w:t>
+            </w:r>
+          </w:p>
+        </w:tc>
+        <w:tc>
+          <w:tcPr>
+            <w:tcW w:type="dxa" w:w="3135"/>
+          </w:tcPr>
+          <w:p>
+            <w:pPr>
+              <w:spacing w:before="20" w:after="20"/>
+            </w:pPr>
+            <w:r>
+              <w:t>13. Industrial</w:t>
+            </w:r>
+          </w:p>
+        </w:tc>
+      </w:tr>
+      <w:tr>
+        <w:tc>
+          <w:tcPr>
+            <w:tcW w:type="dxa" w:w="3135"/>
+          </w:tcPr>
+          <w:p>
+            <w:pPr>
+              <w:spacing w:before="20" w:after="20"/>
+            </w:pPr>
+            <w:r>
+              <w:t>D7SD10</w:t>
+            </w:r>
+          </w:p>
+        </w:tc>
+        <w:tc>
+          <w:tcPr>
+            <w:tcW w:type="dxa" w:w="3135"/>
+          </w:tcPr>
+          <w:p>
+            <w:pPr>
+              <w:spacing w:before="20" w:after="20"/>
+            </w:pPr>
+            <w:r>
+              <w:t>Miravalle</w:t>
+            </w:r>
+          </w:p>
+        </w:tc>
+        <w:tc>
+          <w:tcPr>
+            <w:tcW w:type="dxa" w:w="3135"/>
+          </w:tcPr>
+          <w:p>
+            <w:pPr>
+              <w:spacing w:before="20" w:after="20"/>
+            </w:pPr>
+            <w:r>
+              <w:t>15. Miravalle - Cerro del Cuatro</w:t>
+            </w:r>
+          </w:p>
+        </w:tc>
+      </w:tr>
+    </w:tbl>
+    <w:p/>
+    <w:p>
+      <w:pPr>
+        <w:pStyle w:val="Heading3"/>
+      </w:pPr>
+      <w:r>
+        <w:t>14.4 Conclusión</w:t>
+      </w:r>
+    </w:p>
+    <w:p>
+      <w:pPr>
+        <w:pStyle w:val="ListBullet"/>
+      </w:pPr>
+      <w:r>
+        <w:rPr>
+          <w:b/>
+        </w:rPr>
+        <w:t>No hay falsos negativos</w:t>
+      </w:r>
+      <w:r>
+        <w:t>: todos los subdistritos con restricción real son detectados por WMS (</w:t>
+      </w:r>
+      <w:r>
+        <w:rPr>
+          <w:rFonts w:ascii="Courier New" w:hAnsi="Courier New"/>
+          <w:sz w:val="18"/>
+        </w:rPr>
+        <w:t>PatrimonioLevantamiento</w:t>
+      </w:r>
+      <w:r>
+        <w:t xml:space="preserve"> o </w:t>
+      </w:r>
+      <w:r>
+        <w:rPr>
+          <w:rFonts w:ascii="Courier New" w:hAnsi="Courier New"/>
+          <w:sz w:val="18"/>
+        </w:rPr>
+        <w:t>PIUESyBarrios</w:t>
+      </w:r>
+      <w:r>
+        <w:t xml:space="preserve">) en la rama directa, antes de llegar al fallback </w:t>
+      </w:r>
+      <w:r>
+        <w:rPr>
+          <w:rFonts w:ascii="Courier New" w:hAnsi="Courier New"/>
+          <w:sz w:val="18"/>
+        </w:rPr>
+        <w:t>esCentroHist</w:t>
+      </w:r>
+      <w:r>
+        <w:t>.</w:t>
+      </w:r>
+    </w:p>
+    <w:p>
+      <w:pPr>
+        <w:pStyle w:val="ListBullet"/>
+      </w:pPr>
+      <w:r>
+        <w:rPr>
+          <w:b/>
+        </w:rPr>
+        <w:t>El fix es correcto y suficiente</w:t>
+      </w:r>
+      <w:r>
+        <w:t>: la lógica basada en nombre (</w:t>
+      </w:r>
+      <w:r>
+        <w:rPr>
+          <w:rFonts w:ascii="Courier New" w:hAnsi="Courier New"/>
+          <w:sz w:val="18"/>
+        </w:rPr>
+        <w:t>sub2.includes('centro hist')</w:t>
+      </w:r>
+      <w:r>
+        <w:t>) elimina los 4 falsos positivos sin afectar ningún caso real.</w:t>
+      </w:r>
+    </w:p>
+    <w:p>
+      <w:pPr>
+        <w:pStyle w:val="ListBullet"/>
+      </w:pPr>
+      <w:r>
+        <w:rPr>
+          <w:b/>
+        </w:rPr>
+        <w:t>D5SD05 Tecnológico</w:t>
+      </w:r>
+      <w:r>
+        <w:t xml:space="preserve"> (también tiene </w:t>
+      </w:r>
+      <w:r>
+        <w:rPr>
+          <w:rFonts w:ascii="Courier New" w:hAnsi="Courier New"/>
+          <w:sz w:val="18"/>
+        </w:rPr>
+        <w:t>sub1='05'</w:t>
+      </w:r>
+      <w:r>
+        <w:t>): no es falso positivo porque el WMS devuelve features reales; el fix no lo afecta.</w:t>
+      </w:r>
+    </w:p>
+    <w:p>
+      <w:pPr>
+        <w:pBdr>
+          <w:bottom w:val="single" w:sz="4" w:space="1" w:color="BBBBBB"/>
+        </w:pBdr>
+        <w:spacing w:before="0" w:after="160"/>
+      </w:pPr>
+    </w:p>
+    <w:p>
+      <w:pPr>
+        <w:pStyle w:val="Heading2"/>
+      </w:pPr>
+      <w:r>
+        <w:t>15. Parámetros de la sesión</w:t>
       </w:r>
     </w:p>
     <w:tbl>
@@ -4402,7 +6270,7 @@
               <w:spacing w:before="20" w:after="20"/>
             </w:pPr>
             <w:r>
-              <w:t>12–14 ago 2026</w:t>
+              <w:t>12–15 ago 2026</w:t>
             </w:r>
           </w:p>
         </w:tc>
@@ -4430,7 +6298,7 @@
               <w:spacing w:before="20" w:after="20"/>
             </w:pPr>
             <w:r>
-              <w:t>12 ago 2026 (sesión original) + 14 ago 2026 (sesión continuación)</w:t>
+              <w:t>12 ago 2026 (sesión original) + 14 ago 2026 (sesión continuación) + 15 ago 2026 (bug patrimonial + auditoría)</w:t>
             </w:r>
           </w:p>
         </w:tc>
@@ -4590,7 +6458,7 @@
         <w:pStyle w:val="Heading2"/>
       </w:pPr>
       <w:r>
-        <w:t>14. Estado de módulos al 14 ago 2026</w:t>
+        <w:t>16. Estado de módulos al 15 ago 2026</w:t>
       </w:r>
     </w:p>
     <w:tbl>
@@ -4690,7 +6558,7 @@
               <w:spacing w:before="20" w:after="20"/>
             </w:pPr>
             <w:r>
-              <w:t>Sin cambios</w:t>
+              <w:t>Fix patrimonial (c927da6)</w:t>
             </w:r>
           </w:p>
         </w:tc>
@@ -5066,7 +6934,7 @@
               <w:spacing w:before="20" w:after="20"/>
             </w:pPr>
             <w:r>
-              <w:t>Sin cambios</w:t>
+              <w:t>Fix patrimonial (c927da6)</w:t>
             </w:r>
           </w:p>
         </w:tc>
@@ -5127,7 +6995,7 @@
         <w:pStyle w:val="Heading2"/>
       </w:pPr>
       <w:r>
-        <w:t>15. Pendientes arrastrados</w:t>
+        <w:t>17. Pendientes arrastrados</w:t>
       </w:r>
     </w:p>
     <w:p>
@@ -5271,7 +7139,7 @@
         <w:rPr>
           <w:i/>
         </w:rPr>
-        <w:t>Bitácora generada: 12 ago 2026 · Actualizada: 14 ago 2026 · Fernando H.</w:t>
+        <w:t>Bitácora generada: 12 ago 2026 · Actualizada: 15 ago 2026 · Fernando H.</w:t>
       </w:r>
     </w:p>
     <w:sectPr>

</xml_diff>